<commit_message>
Hoàn thành làm lại đồ án: RAG phân loại câu hỏi + router truy xuất
- Tầng phân loại 2 nhãn (14 chủ đề + 4 loại câu hỏi) — Qwen few-shot, guardrail 3 lớp
- Router ánh xạ nhãn -> cấu hình truy xuất; tách truy vấn con cho câu SO_SANH
- A/B trên benchmark v3: Hit@3 60.8->77.3% (+16.5pp), MRR +50.9% tuong doi — GATE DAT
- 319 unit test offline; bao cao: docs/bao_cao/; so sanh: outputs/ab_comparison.md
- Bo prompt phat trien da-agent: prompts/ (archive/ chua 23 prompt da chay)
</commit_message>
<xml_diff>
--- a/SYSTEM_ARCHITECTURE.docx
+++ b/SYSTEM_ARCHITECTURE.docx
@@ -217,7 +217,7 @@
         <w:pStyle w:val="ListBullet"/>
       </w:pPr>
       <w:r>
-        <w:t>**Dataset**: 15 câu hỏi benchmark trong `data/evaluation/benchmark_questions.json`</w:t>
+        <w:t>**Dataset**: 100 câu hỏi benchmark v3 trong `data/evaluation/benchmark_100_questions_v3.json` (kèm nhãn chủ đề + question_type chuẩn — ground truth của tầng phân loại)</w:t>
       </w:r>
     </w:p>
     <w:p>
@@ -1730,7 +1730,7 @@
         <w:pStyle w:val="Heading1"/>
       </w:pPr>
       <w:r>
-        <w:t>5. Luồng dữ liệu end-to-end</w:t>
+        <w:t>5. Luồng dữ liệu end-to-end (6 tầng)</w:t>
       </w:r>
     </w:p>
     <w:p/>
@@ -1749,6 +1749,36 @@
         <w:t>│                     CÂU HỎI SINH VIÊN                         │</w:t>
         <w:br/>
         <w:t>│          "Bị điểm yếu có bị đuổi học không ad?"                 │</w:t>
+        <w:br/>
+        <w:t>└────────────────────────┬────────────────────────────────────────┘</w:t>
+        <w:br/>
+        <w:t xml:space="preserve">                         │</w:t>
+        <w:br/>
+        <w:t xml:space="preserve">                         ▼</w:t>
+        <w:br/>
+        <w:t>┌─────────────────────────────────────────────────────────────────┐</w:t>
+        <w:br/>
+        <w:t>│      LAYER 0: PHÂN LOẠI CÂU HỎI + ROUTER (Qwen local)          │</w:t>
+        <w:br/>
+        <w:t>│  - src/classifier.py: gán 2 nhãn cho câu hỏi THÔ:              │</w:t>
+        <w:br/>
+        <w:t>│      topic = "đánh giá rèn luyện" (1/14 chủ đề)                │</w:t>
+        <w:br/>
+        <w:t>│      question_type = "TRA_CUU" (1/4 loại)                      │</w:t>
+        <w:br/>
+        <w:t>│  - src/router.py: nhãn → cấu hình truy xuất theo lớp           │</w:t>
+        <w:br/>
+        <w:t>│      TRA_CUU giữ base; SO_SANH top_k+2 + tách truy vấn con;    │</w:t>
+        <w:br/>
+        <w:t>│      THU_TUC BM25 0.6/Chroma 0.4; topic → lọc nguồn (nếu đủ    │</w:t>
+        <w:br/>
+        <w:t>│      bằng chứng: "đánh giá rèn luyện" → 1059-qd-dhag-…pdf)     │</w:t>
+        <w:br/>
+        <w:t>│  - Guardrail 3 lớp, suy giảm mềm: mọi lỗi → cấu hình gốc       │</w:t>
+        <w:br/>
+        <w:t>│  - TẮT bằng ENABLE_CLASSIFIER=0 → pipeline chạy y hệt 5 tầng   │</w:t>
+        <w:br/>
+        <w:t>│    còn lại (hành vi cũ giữ nguyên từng bước)                    │</w:t>
         <w:br/>
         <w:t>└────────────────────────┬────────────────────────────────────────┘</w:t>
         <w:br/>
@@ -1794,17 +1824,47 @@
         <w:br/>
         <w:t>┌─────────────────────────────────────────────────────────────────┐</w:t>
         <w:br/>
-        <w:t>│         LAYER 3: TRUE HYBRID SEARCH (BM25 + ChromaDB)          │</w:t>
+        <w:t>│   LAYER 3: TÁCH TRUY VẤN CON (chỉ câu SO_SANH — P3.3)          │</w:t>
         <w:br/>
-        <w:t>│  ┌─────────────────────────────────────────────────────────┐   │</w:t>
+        <w:t>│  - src/retrieval.py: split_comparison_query() tách câu so       │</w:t>
         <w:br/>
-        <w:t>│  │  BM25 Retriever:  Tìm kiếm từ khóa chính xác           │   │</w:t>
+        <w:t>│    sánh thành 2–3 mệnh đề con độc lập (Qwen local)              │</w:t>
         <w:br/>
-        <w:t>│  │  ChromaDB Retriever: Tìm kiếm ngữ nghĩa (BGE-M3)       │   │</w:t>
+        <w:t>│  - Guardrail chống tách dở: số dòng ngoài 2–3, truy vấn con     │</w:t>
         <w:br/>
-        <w:t>│  │  EnsembleRetriever: RRF dung hợp thứ hạng              │   │</w:t>
+        <w:t>│    &gt;200 ký tự, cặp trùng &gt;80% token → lùi về đường đơn          │</w:t>
         <w:br/>
-        <w:t>│  └─────────────────────────────────────────────────────────┘   │</w:t>
+        <w:t>│  - Câu TRA_CUU/THU_TUC/NGOAI_PHAM_VI đi thẳng qua tầng này      │</w:t>
+        <w:br/>
+        <w:t>└────────────────────────┬────────────────────────────────────────┘</w:t>
+        <w:br/>
+        <w:t xml:space="preserve">                         │</w:t>
+        <w:br/>
+        <w:t xml:space="preserve">                         ▼</w:t>
+        <w:br/>
+        <w:t>┌─────────────────────────────────────────────────────────────────┐</w:t>
+        <w:br/>
+        <w:t>│   LAYER 4: TRUE HYBRID SEARCH (tham số THEO ROUTER)            │</w:t>
+        <w:br/>
+        <w:t>│   ┌─────────────────────────────────────────────────────────┐   │</w:t>
+        <w:br/>
+        <w:t>│   │  BM25 Retriever:  Tìm kiếm từ khóa chính xác           │   │</w:t>
+        <w:br/>
+        <w:t>│   │  ChromaDB Retriever: Tìm kiếm ngữ nghĩa (BGE-M3)       │   │</w:t>
+        <w:br/>
+        <w:t>│   │  EnsembleRetriever: RRF dung hợp thứ hạng              │   │</w:t>
+        <w:br/>
+        <w:t>│   └─────────────────────────────────────────────────────────┘   │</w:t>
+        <w:br/>
+        <w:t>│  - Tham số từng lượt hỏi do LAYER 0 quyết định: top_k           │</w:t>
+        <w:br/>
+        <w:t>│    (SO_SANH +2), trọng số BM25/Chroma (THU_TUC 0.6/0.4),        │</w:t>
+        <w:br/>
+        <w:t>│    lọc nguồn theo chủ đề (src/router.py)                        │</w:t>
+        <w:br/>
+        <w:t>│  - Đường đa nhánh: truy xuất TỪNG truy vấn con rồi gộp          │</w:t>
+        <w:br/>
+        <w:t>│    (dedup theo chunk_id, giữ rank tốt nhất)                     │</w:t>
         <w:br/>
         <w:t>│  - Output: Top-K chunks với metadata (source, tier, chunk_id) │</w:t>
         <w:br/>
@@ -1816,9 +1876,19 @@
         <w:br/>
         <w:t>┌─────────────────────────────────────────────────────────────────┐</w:t>
         <w:br/>
-        <w:t>│          LAYER 4: GENERATOR (Gemini API)                        │</w:t>
+        <w:t>│   LAYER 5: GENERATOR (prompt THEO LOẠI CÂU HỎI)                 │</w:t>
         <w:br/>
         <w:t>│  - Build prompt: Ngữ cảnh + Câu hỏi + Quy tắc trích dẫn      │</w:t>
+        <w:br/>
+        <w:t>│  - Biến thể định dạng theo question_type (P3.4):                │</w:t>
+        <w:br/>
+        <w:t>│      SO_SANH → bảng so sánh theo tiêu chí, mỗi ô có trích dẫn   │</w:t>
+        <w:br/>
+        <w:t>│      THU_TUC → các bước đánh số, mỗi bước kèm căn cứ            │</w:t>
+        <w:br/>
+        <w:t>│      NGOAI_PHAM_VI → thêm dòng từ chối chuẩn (KHÔNG skip        │</w:t>
+        <w:br/>
+        <w:t>│        truy xuất — tránh từ chối oan khi nhãn sai)              │</w:t>
         <w:br/>
         <w:t>│  - System Instruction: Chống ảo giác, bắt buộc trích dẫn      │</w:t>
         <w:br/>
@@ -1862,7 +1932,7 @@
         <w:pStyle w:val="Heading1"/>
       </w:pPr>
       <w:r>
-        <w:t>6. Response Caching</w:t>
+        <w:t>6. Phân loại câu hỏi &amp; Truy xuất theo lớp (P3.1–P3.4)</w:t>
       </w:r>
     </w:p>
     <w:p/>
@@ -1871,7 +1941,666 @@
         <w:pStyle w:val="Heading2"/>
       </w:pPr>
       <w:r>
-        <w:t>6.1 Cache Key Design</w:t>
+        <w:t>6.1 Classifier hai nhãn — `src/classifier.py`</w:t>
+      </w:r>
+    </w:p>
+    <w:p/>
+    <w:p>
+      <w:r>
+        <w:rPr>
+          <w:sz w:val="22"/>
+        </w:rPr>
+        <w:t>**Vai trò**: gán cho câu hỏi THÔ hai nhãn trước khi hệ thống chạm vào bất kỳ tầng</w:t>
+      </w:r>
+    </w:p>
+    <w:p>
+      <w:r>
+        <w:rPr>
+          <w:sz w:val="22"/>
+        </w:rPr>
+        <w:t>truy xuất nào — `topic` (1 trong 14 chủ đề của TAXONOMY.md, hoặc `null` nếu</w:t>
+      </w:r>
+    </w:p>
+    <w:p>
+      <w:r>
+        <w:rPr>
+          <w:sz w:val="22"/>
+        </w:rPr>
+        <w:t>không thuộc nhóm nào) và `question_type` (1 trong 4 nhãn `TRA_CUU` / `SO_SANH`</w:t>
+      </w:r>
+    </w:p>
+    <w:p>
+      <w:r>
+        <w:rPr>
+          <w:sz w:val="22"/>
+        </w:rPr>
+        <w:t>/ `THU_TUC` / `NGOAI_PHAM_VI`).</w:t>
+      </w:r>
+    </w:p>
+    <w:p/>
+    <w:p>
+      <w:r>
+        <w:rPr>
+          <w:sz w:val="22"/>
+        </w:rPr>
+        <w:t>**Mô hình &amp; prompt**:</w:t>
+      </w:r>
+    </w:p>
+    <w:p>
+      <w:pPr>
+        <w:pStyle w:val="ListBullet"/>
+      </w:pPr>
+      <w:r>
+        <w:t>Qwen2.5-1.5B-Instruct qua Ollama — không dùng Gemini, **không tốn quota**;</w:t>
+      </w:r>
+    </w:p>
+    <w:p>
+      <w:r>
+        <w:rPr>
+          <w:sz w:val="22"/>
+        </w:rPr>
+        <w:t xml:space="preserve">  `temperature=0.0`, tối đa 160 token output, timeout `CLASSIFIER_TIMEOUT`</w:t>
+      </w:r>
+    </w:p>
+    <w:p>
+      <w:r>
+        <w:rPr>
+          <w:sz w:val="22"/>
+        </w:rPr>
+        <w:t xml:space="preserve">  (mặc định 20 giây).</w:t>
+      </w:r>
+    </w:p>
+    <w:p>
+      <w:pPr>
+        <w:pStyle w:val="ListBullet"/>
+      </w:pPr>
+      <w:r>
+        <w:t>Prompt few-shot **cố định 16 ví dụ** chọn trước từ benchmark v3 (đủ 14 chủ</w:t>
+      </w:r>
+    </w:p>
+    <w:p>
+      <w:r>
+        <w:rPr>
+          <w:sz w:val="22"/>
+        </w:rPr>
+        <w:t xml:space="preserve">  đề; mỗi loại hiếm SO_SANH / THU_TUC / NGOAI_PHAM_VI có 3 ví dụ) — mỗi ví dụ</w:t>
+      </w:r>
+    </w:p>
+    <w:p>
+      <w:r>
+        <w:rPr>
+          <w:sz w:val="22"/>
+        </w:rPr>
+        <w:t xml:space="preserve">  kèm dòng "Dấu hiệu" để model bám quy tắc thay vì nhại đáp án; khối quy tắc</w:t>
+      </w:r>
+    </w:p>
+    <w:p>
+      <w:r>
+        <w:rPr>
+          <w:sz w:val="22"/>
+        </w:rPr>
+        <w:t xml:space="preserve">  được nhắc lại NGAY TRƯỚC câu hỏi (tránh Qwen nhỏ trôi về nhãn TRA_CUU).</w:t>
+      </w:r>
+    </w:p>
+    <w:p>
+      <w:pPr>
+        <w:pStyle w:val="ListBullet"/>
+      </w:pPr>
+      <w:r>
+        <w:t>few-shot đóng băng làm v1 — không tinh chỉnh thêm trên chính bộ 100 câu đo</w:t>
+      </w:r>
+    </w:p>
+    <w:p>
+      <w:r>
+        <w:rPr>
+          <w:sz w:val="22"/>
+        </w:rPr>
+        <w:t xml:space="preserve">  (tránh overfit).</w:t>
+      </w:r>
+    </w:p>
+    <w:p/>
+    <w:p>
+      <w:r>
+        <w:rPr>
+          <w:sz w:val="22"/>
+        </w:rPr>
+        <w:t>**Guardrail 3 lớp (suy giảm mềm — pipeline không bao giờ chết vì classifier)**:</w:t>
+      </w:r>
+    </w:p>
+    <w:p/>
+    <w:p>
+      <w:pPr>
+        <w:pStyle w:val="NoSpacing"/>
+      </w:pPr>
+      <w:r>
+        <w:rPr>
+          <w:rFonts w:ascii="Courier New" w:hAnsi="Courier New"/>
+          <w:color w:val="323232"/>
+          <w:sz w:val="18"/>
+        </w:rPr>
+        <w:t>Lớp 1: Qwen trả JSON hợp lệ + nhãn chuẩn → dùng luôn</w:t>
+        <w:br/>
+        <w:t xml:space="preserve">       (topic chuẩn hóa không dấu qua fold(), chịu khác biệt dấu/hoa-thường)</w:t>
+        <w:br/>
+        <w:t>Lớp 2: JSON lỗi hoặc nhãn lạ → bổ sung phần nhãn hỏng bằng bảng từ khóa</w:t>
+        <w:br/>
+        <w:t xml:space="preserve">       (dấu hiệu theo TAXONOMY.md; từ khóa neo đặc thù xét TRƯỚC từ khóa chung)</w:t>
+        <w:br/>
+        <w:t>Lớp 3: từ khóa cũng không khớp → topic=None, question_type="TRA_CUU"</w:t>
+        <w:br/>
+        <w:t xml:space="preserve">       (router hiểu topic=None là không lọc, dùng cấu hình chung)</w:t>
+      </w:r>
+    </w:p>
+    <w:p/>
+    <w:p>
+      <w:r>
+        <w:rPr>
+          <w:sz w:val="22"/>
+        </w:rPr>
+        <w:t>Ollama chết / timeout → trả thẳng kết quả lớp 3 kèm log cảnh báo, **không ném</w:t>
+      </w:r>
+    </w:p>
+    <w:p>
+      <w:r>
+        <w:rPr>
+          <w:sz w:val="22"/>
+        </w:rPr>
+        <w:t>ngoại lệ** ra pipeline.</w:t>
+      </w:r>
+    </w:p>
+    <w:p/>
+    <w:p>
+      <w:r>
+        <w:rPr>
+          <w:sz w:val="22"/>
+        </w:rPr>
+        <w:t>**Độ chính xác đo được (benchmark 100 câu v3, P2.3 — GATE đạt)**: topic ~85%,</w:t>
+      </w:r>
+    </w:p>
+    <w:p>
+      <w:r>
+        <w:rPr>
+          <w:sz w:val="22"/>
+        </w:rPr>
+        <w:t>question_type ~81%, recall lớp hiếm 100%; điểm yếu đã biết: over-predict lớp</w:t>
+      </w:r>
+    </w:p>
+    <w:p>
+      <w:r>
+        <w:rPr>
+          <w:sz w:val="22"/>
+        </w:rPr>
+        <w:t>hiếm, biên mơ giữa TTTN-vs-CTĐT và SV Giỏi-vs-SV5T.</w:t>
+      </w:r>
+    </w:p>
+    <w:p/>
+    <w:p>
+      <w:r>
+        <w:rPr>
+          <w:sz w:val="22"/>
+        </w:rPr>
+        <w:t>---</w:t>
+      </w:r>
+    </w:p>
+    <w:p/>
+    <w:p>
+      <w:pPr>
+        <w:pStyle w:val="Heading2"/>
+      </w:pPr>
+      <w:r>
+        <w:t>6.2 Router truy xuất theo lớp — `src/router.py`</w:t>
+      </w:r>
+    </w:p>
+    <w:p/>
+    <w:p>
+      <w:r>
+        <w:rPr>
+          <w:sz w:val="22"/>
+        </w:rPr>
+        <w:t>**Nguyên tắc thiết kế**: *mặc định = cấu hình hiện tại của hệ thống* (top_k từ</w:t>
+      </w:r>
+    </w:p>
+    <w:p>
+      <w:r>
+        <w:rPr>
+          <w:sz w:val="22"/>
+        </w:rPr>
+        <w:t>`RAG_TOP_K`, BM25 0.5 / Chroma 0.5, không lọc nguồn). Nhãn chỉ **điều chỉnh**,</w:t>
+      </w:r>
+    </w:p>
+    <w:p>
+      <w:r>
+        <w:rPr>
+          <w:sz w:val="22"/>
+        </w:rPr>
+        <w:t>không đổi bản chất pipeline:</w:t>
+      </w:r>
+    </w:p>
+    <w:p>
+      <w:pPr>
+        <w:pStyle w:val="ListBullet"/>
+      </w:pPr>
+      <w:r>
+        <w:t>Không có nhãn (classifier tắt / lỗi / câu tự do) → trả nguyên cấu hình nền.</w:t>
+      </w:r>
+    </w:p>
+    <w:p>
+      <w:pPr>
+        <w:pStyle w:val="ListBullet"/>
+      </w:pPr>
+      <w:r>
+        <w:t>Không bao giờ giảm top_k dưới giá trị gốc; không bao giờ trả trọng số tổng ≤ 0.</w:t>
+      </w:r>
+    </w:p>
+    <w:p>
+      <w:pPr>
+        <w:pStyle w:val="ListBullet"/>
+      </w:pPr>
+      <w:r>
+        <w:t>`get_retrieval_config(labels, base)` là hàm thuần (không I/O, không gọi model).</w:t>
+      </w:r>
+    </w:p>
+    <w:p/>
+    <w:p>
+      <w:r>
+        <w:rPr>
+          <w:sz w:val="22"/>
+        </w:rPr>
+        <w:t>**Bảng điều chỉnh theo `question_type`** (dataclass `RetrievalConfig`: top_k,</w:t>
+      </w:r>
+    </w:p>
+    <w:p>
+      <w:r>
+        <w:rPr>
+          <w:sz w:val="22"/>
+        </w:rPr>
+        <w:t>bm25_weight, chroma_weight, source_filter, enable_subquery):</w:t>
+      </w:r>
+    </w:p>
+    <w:p/>
+    <w:p>
+      <w:r>
+        <w:rPr>
+          <w:sz w:val="18"/>
+        </w:rPr>
+        <w:t>Loại | Điều chỉnh | Lý do</w:t>
+      </w:r>
+    </w:p>
+    <w:p>
+      <w:r>
+        <w:rPr>
+          <w:sz w:val="18"/>
+        </w:rPr>
+        <w:t>`TRA_CUU` | giữ nguyên base | câu tra cứu đơn — cấu hình chung đã tối</w:t>
+      </w:r>
+    </w:p>
+    <w:p>
+      <w:r>
+        <w:rPr>
+          <w:sz w:val="18"/>
+        </w:rPr>
+        <w:t>`SO_SANH` | top_k + 2, bật `enable_subquery` | cần cửa sổ rộng để đối chiếu nhiều phía</w:t>
+      </w:r>
+    </w:p>
+    <w:p>
+      <w:r>
+        <w:rPr>
+          <w:sz w:val="18"/>
+        </w:rPr>
+        <w:t>`THU_TUC` | BM25 0.6 / Chroma 0.4 | thủ tục hay dùng từ khóa hành chính (giả thuyết, hiệu chỉnh theo A/B)</w:t>
+      </w:r>
+    </w:p>
+    <w:p>
+      <w:r>
+        <w:rPr>
+          <w:sz w:val="18"/>
+        </w:rPr>
+        <w:t>`NGOAI_PHAM_VI` | giữ nguyên base — **KHÔNG skip truy xuất** | precision nhãn này chỉ ~25%: skip truy xuất = từ chối oan câu đúng; nhắc từ chối nằm ở tầng generator</w:t>
+      </w:r>
+    </w:p>
+    <w:p/>
+    <w:p>
+      <w:r>
+        <w:rPr>
+          <w:sz w:val="22"/>
+        </w:rPr>
+        <w:t>**Bảng `TOPIC_SOURCE_FILTER`** (chủ đề → file nguồn được lọc qua metadata</w:t>
+      </w:r>
+    </w:p>
+    <w:p>
+      <w:r>
+        <w:rPr>
+          <w:sz w:val="22"/>
+        </w:rPr>
+        <w:t>`source` của ChromaDB): chỉ chủ đề có **≥ 5 câu** trong benchmark v3 VÀ</w:t>
+      </w:r>
+    </w:p>
+    <w:p>
+      <w:r>
+        <w:rPr>
+          <w:sz w:val="22"/>
+        </w:rPr>
+        <w:t>**≥ 80%** số câu in-corpus nằm gọn trong **≤ 2 nguồn** mới được lọc (thiết kế</w:t>
+      </w:r>
+    </w:p>
+    <w:p>
+      <w:r>
+        <w:rPr>
+          <w:sz w:val="22"/>
+        </w:rPr>
+        <w:t>phòng thủ — lọc hẹp làm rơi căn cứ nằm ở văn bản phụ). Đủ ngưỡng: 8 chủ đề;</w:t>
+      </w:r>
+    </w:p>
+    <w:p>
+      <w:r>
+        <w:rPr>
+          <w:sz w:val="22"/>
+        </w:rPr>
+        <w:t>6 chủ đề còn lại (n = 1–3 câu) cố ý KHÔNG có filter, suy giảm về cấu hình chung.</w:t>
+      </w:r>
+    </w:p>
+    <w:p/>
+    <w:p>
+      <w:r>
+        <w:rPr>
+          <w:sz w:val="22"/>
+        </w:rPr>
+        <w:t>---</w:t>
+      </w:r>
+    </w:p>
+    <w:p/>
+    <w:p>
+      <w:pPr>
+        <w:pStyle w:val="Heading2"/>
+      </w:pPr>
+      <w:r>
+        <w:t>6.3 Tách truy vấn con cho SO_SANH — `split_comparison_query()` trong `src/retrieval.py`</w:t>
+      </w:r>
+    </w:p>
+    <w:p/>
+    <w:p>
+      <w:r>
+        <w:rPr>
+          <w:sz w:val="22"/>
+        </w:rPr>
+        <w:t>**Điều kiện kích hoạt** (pipeline P3.3): router bật `enable_subquery` VÀ nhãn</w:t>
+      </w:r>
+    </w:p>
+    <w:p>
+      <w:r>
+        <w:rPr>
+          <w:sz w:val="22"/>
+        </w:rPr>
+        <w:t>`question_type = SO_SANH`. Tách thực hiện trên câu **đã chuẩn hóa nhưng chưa</w:t>
+      </w:r>
+    </w:p>
+    <w:p>
+      <w:r>
+        <w:rPr>
+          <w:sz w:val="22"/>
+        </w:rPr>
+        <w:t>mở rộng từ đồng nghĩa** — cụm đồng nghĩa ghép ở cuối chuỗi làm Qwen 1.5B nhại</w:t>
+      </w:r>
+    </w:p>
+    <w:p>
+      <w:r>
+        <w:rPr>
+          <w:sz w:val="22"/>
+        </w:rPr>
+        <w:t>lại (parrot/echo) thay vì tách.</w:t>
+      </w:r>
+    </w:p>
+    <w:p/>
+    <w:p>
+      <w:r>
+        <w:rPr>
+          <w:sz w:val="22"/>
+        </w:rPr>
+        <w:t>**Cách tách**: Qwen local tách câu so sánh / tổng hợp thành **2–3 mệnh đề con</w:t>
+      </w:r>
+    </w:p>
+    <w:p>
+      <w:r>
+        <w:rPr>
+          <w:sz w:val="22"/>
+        </w:rPr>
+        <w:t>độc lập** (mỗi mệnh đề hỏi đúng một vế; giữ nguyên thực thể số, mã, tên văn</w:t>
+      </w:r>
+    </w:p>
+    <w:p>
+      <w:r>
+        <w:rPr>
+          <w:sz w:val="22"/>
+        </w:rPr>
+        <w:t>bản; few-shot 2 ví dụ cố định). Mỗi truy vấn con được mở rộng từ đồng nghĩa</w:t>
+      </w:r>
+    </w:p>
+    <w:p>
+      <w:r>
+        <w:rPr>
+          <w:sz w:val="22"/>
+        </w:rPr>
+        <w:t>riêng rồi truy xuất độc lập (cùng retrieve_k như đường đơn), sau đó gộp bằng</w:t>
+      </w:r>
+    </w:p>
+    <w:p>
+      <w:r>
+        <w:rPr>
+          <w:sz w:val="22"/>
+        </w:rPr>
+        <w:t>dedup theo chunk_id + giữ rank tốt nhất.</w:t>
+      </w:r>
+    </w:p>
+    <w:p/>
+    <w:p>
+      <w:r>
+        <w:rPr>
+          <w:sz w:val="22"/>
+        </w:rPr>
+        <w:t>**Guardrail chống tách dở — mọi vi phạm đều lùi về `[query]` (đường đơn)**:</w:t>
+      </w:r>
+    </w:p>
+    <w:p/>
+    <w:p>
+      <w:pPr>
+        <w:pStyle w:val="NoSpacing"/>
+      </w:pPr>
+      <w:r>
+        <w:rPr>
+          <w:rFonts w:ascii="Courier New" w:hAnsi="Courier New"/>
+          <w:color w:val="323232"/>
+          <w:sz w:val="18"/>
+        </w:rPr>
+        <w:t>(1) số dòng ngoài khoảng 2–3                          → không tách</w:t>
+        <w:br/>
+        <w:t>(2) truy vấn con dài &gt; 200 ký tự (nghi model trả lời   → không tách</w:t>
+        <w:br/>
+        <w:t xml:space="preserve">    thay vì tách)</w:t>
+        <w:br/>
+        <w:t>(3) cặp truy vấn con trùng nhau quá 80% token          → không tách</w:t>
+        <w:br/>
+        <w:t xml:space="preserve">    (Jaccard token phi-số; cặp chỉ KHÁC THỰC THỂ SỐ</w:t>
+        <w:br/>
+        <w:t xml:space="preserve">    như "ELO 6 / ELO 7 / ELO 8" được GIỮ — đúng mục</w:t>
+        <w:br/>
+        <w:t xml:space="preserve">    tiêu mở độ phủ của dạng SO_SANH)</w:t>
+      </w:r>
+    </w:p>
+    <w:p/>
+    <w:p>
+      <w:r>
+        <w:rPr>
+          <w:sz w:val="22"/>
+        </w:rPr>
+        <w:t>Tách dở lỡ lọt vẫn an toàn: tầng gộp đảm bảo ngữ cảnh không tệ hơn đường đơn —</w:t>
+      </w:r>
+    </w:p>
+    <w:p>
+      <w:r>
+        <w:rPr>
+          <w:sz w:val="22"/>
+        </w:rPr>
+        <w:t>câu TRA_CUU bị gán nhầm SO_SANH vì thế luôn chạy đúng như cũ.</w:t>
+      </w:r>
+    </w:p>
+    <w:p/>
+    <w:p>
+      <w:r>
+        <w:rPr>
+          <w:sz w:val="22"/>
+        </w:rPr>
+        <w:t>---</w:t>
+      </w:r>
+    </w:p>
+    <w:p/>
+    <w:p>
+      <w:pPr>
+        <w:pStyle w:val="Heading2"/>
+      </w:pPr>
+      <w:r>
+        <w:t>6.4 Sinh trả lời theo loại câu hỏi — `src/generator.py`</w:t>
+      </w:r>
+    </w:p>
+    <w:p/>
+    <w:p>
+      <w:r>
+        <w:rPr>
+          <w:sz w:val="22"/>
+        </w:rPr>
+        <w:t>`select_prompt_rules(question_type)` chọn biến thể khối quy tắc — **thiết kế</w:t>
+      </w:r>
+    </w:p>
+    <w:p>
+      <w:r>
+        <w:rPr>
+          <w:sz w:val="22"/>
+        </w:rPr>
+        <w:t>cache-an toàn**: biến thể chỉ NỐI THÊM vào đuôi `PROMPT_RULES` gốc, đường</w:t>
+      </w:r>
+    </w:p>
+    <w:p>
+      <w:r>
+        <w:rPr>
+          <w:sz w:val="22"/>
+        </w:rPr>
+        <w:t>`None`/`TRA_CUU` dùng nguyên văn gốc nên prompt xuất ra giống hệt từng ký tự</w:t>
+      </w:r>
+    </w:p>
+    <w:p>
+      <w:r>
+        <w:rPr>
+          <w:sz w:val="22"/>
+        </w:rPr>
+        <w:t>hành vi cũ (cache cũ vẫn trúng, không cần bump `PROMPT_VERSION`):</w:t>
+      </w:r>
+    </w:p>
+    <w:p/>
+    <w:p>
+      <w:r>
+        <w:rPr>
+          <w:sz w:val="18"/>
+        </w:rPr>
+        <w:t>question_type | Biến thể prompt</w:t>
+      </w:r>
+    </w:p>
+    <w:p>
+      <w:r>
+        <w:rPr>
+          <w:sz w:val="18"/>
+        </w:rPr>
+        <w:t>`SO_SANH` | bảng so sánh theo tiêu chí; mỗi ô có trích dẫn riêng; không trộn số liệu giữa các vế; thiếu căn cứ một vế → nêu rõ, không bịa</w:t>
+      </w:r>
+    </w:p>
+    <w:p>
+      <w:r>
+        <w:rPr>
+          <w:sz w:val="18"/>
+        </w:rPr>
+        <w:t>`THU_TUC` | các bước đánh số theo thứ tự; mỗi bước kèm căn cứ (Điều/Khoản — file); hồ sơ kèm theo liệt kê từng dòng</w:t>
+      </w:r>
+    </w:p>
+    <w:p>
+      <w:r>
+        <w:rPr>
+          <w:sz w:val="18"/>
+        </w:rPr>
+        <w:t>`NGOAI_PHAM_VI` | thêm 1 dòng: ngữ cảnh không chứa thông tin liên quan → trả lời đúng một câu từ chối chuẩn</w:t>
+      </w:r>
+    </w:p>
+    <w:p>
+      <w:r>
+        <w:rPr>
+          <w:sz w:val="18"/>
+        </w:rPr>
+        <w:t>`None` / `TRA_CUU` / nhãn lạ | `PROMPT_RULES` gốc</w:t>
+      </w:r>
+    </w:p>
+    <w:p/>
+    <w:p>
+      <w:r>
+        <w:rPr>
+          <w:sz w:val="22"/>
+        </w:rPr>
+        <w:t>**`NGOAI_PHAM_VI` không skip truy xuất**: skip-early chỉ là thí nghiệm tùy chọn</w:t>
+      </w:r>
+    </w:p>
+    <w:p>
+      <w:r>
+        <w:rPr>
+          <w:sz w:val="22"/>
+        </w:rPr>
+        <w:t>(chỉ cân nhắc khi nhãn đủ tin cậy). Hiện trạng: vẫn truy xuất đầy đủ; tầng</w:t>
+      </w:r>
+    </w:p>
+    <w:p>
+      <w:r>
+        <w:rPr>
+          <w:sz w:val="22"/>
+        </w:rPr>
+        <w:t>generator chèn nhắc từ chối chuẩn, và `canonicalize_refusal()` chuẩn hóa câu</w:t>
+      </w:r>
+    </w:p>
+    <w:p>
+      <w:r>
+        <w:rPr>
+          <w:sz w:val="22"/>
+        </w:rPr>
+        <w:t>tự từ chối về ĐÚNG chuỗi `REFUSAL_TEXT` (câu trả lời có căn cứ giữ nguyên từng</w:t>
+      </w:r>
+    </w:p>
+    <w:p>
+      <w:r>
+        <w:rPr>
+          <w:sz w:val="22"/>
+        </w:rPr>
+        <w:t>ký tự — nhãn sai thì câu trả lời đúng không bị mất). Áp cho cả Gemini lẫn Qwen.</w:t>
+      </w:r>
+    </w:p>
+    <w:p/>
+    <w:p>
+      <w:r>
+        <w:rPr>
+          <w:sz w:val="22"/>
+        </w:rPr>
+        <w:t>---</w:t>
+      </w:r>
+    </w:p>
+    <w:p/>
+    <w:p>
+      <w:pPr>
+        <w:pStyle w:val="Heading1"/>
+      </w:pPr>
+      <w:r>
+        <w:t>7. Response Caching</w:t>
+      </w:r>
+    </w:p>
+    <w:p/>
+    <w:p>
+      <w:pPr>
+        <w:pStyle w:val="Heading2"/>
+      </w:pPr>
+      <w:r>
+        <w:t>7.1 Cache Key Design</w:t>
       </w:r>
     </w:p>
     <w:p/>
@@ -1937,7 +2666,7 @@
         <w:pStyle w:val="Heading2"/>
       </w:pPr>
       <w:r>
-        <w:t>6.2 Cache Storage</w:t>
+        <w:t>7.2 Cache Storage</w:t>
       </w:r>
     </w:p>
     <w:p/>
@@ -1990,7 +2719,7 @@
         <w:pStyle w:val="Heading2"/>
       </w:pPr>
       <w:r>
-        <w:t>6.3 Cache Behavior</w:t>
+        <w:t>7.3 Cache Behavior</w:t>
       </w:r>
     </w:p>
     <w:p/>
@@ -2042,7 +2771,7 @@
         <w:pStyle w:val="Heading1"/>
       </w:pPr>
       <w:r>
-        <w:t>7. Cấu trúc thư mục dự án</w:t>
+        <w:t>8. Cấu trúc thư mục dự án</w:t>
       </w:r>
     </w:p>
     <w:p/>
@@ -2070,13 +2799,17 @@
         <w:br/>
         <w:t>│   └── evaluation/</w:t>
         <w:br/>
-        <w:t>│       └── benchmark_questions.json  # 15 câu benchmark</w:t>
+        <w:t>│       └── benchmark_100_questions_v3.json  # 100 câu benchmark v3 (có nhãn question_type)</w:t>
         <w:br/>
         <w:t>├── src/</w:t>
         <w:br/>
         <w:t>│   ├── query_normalizer.py  # Chuẩn hóa câu hỏi (Qwen)</w:t>
         <w:br/>
-        <w:t>│   ├── retrieval.py         # Query expansion, từ điển đồng nghĩa</w:t>
+        <w:t>│   ├── classifier.py        # Phân loại câu hỏi 2 nhãn (chủ đề + loại, Qwen local)</w:t>
+        <w:br/>
+        <w:t>│   ├── router.py            # Nhãn phân loại → cấu hình truy xuất theo lớp</w:t>
+        <w:br/>
+        <w:t>│   ├── retrieval.py         # Query expansion, từ điển đồng nghĩa, tách truy vấn con</w:t>
         <w:br/>
         <w:t>│   ├── generator.py         # Generator (Gemini) + Fallback (Qwen)</w:t>
         <w:br/>
@@ -2138,7 +2871,7 @@
         <w:pStyle w:val="Heading1"/>
       </w:pPr>
       <w:r>
-        <w:t>8. Cấu hình môi trường</w:t>
+        <w:t>9. Cấu hình môi trường</w:t>
       </w:r>
     </w:p>
     <w:p/>
@@ -2255,6 +2988,30 @@
         <w:t>`USE_QWEN_GENERATOR` | `0` | Dùng Qwen làm generator chính (offline)</w:t>
       </w:r>
     </w:p>
+    <w:p>
+      <w:r>
+        <w:rPr>
+          <w:sz w:val="18"/>
+        </w:rPr>
+        <w:t>`ENABLE_CLASSIFIER` | `0` | Bật/tắt tầng phân loại câu hỏi + router truy xuất theo lớp (mục 6)</w:t>
+      </w:r>
+    </w:p>
+    <w:p>
+      <w:r>
+        <w:rPr>
+          <w:sz w:val="18"/>
+        </w:rPr>
+        <w:t>`CLASSIFIER_MODEL` | (OLLAMA_MODEL) | Model Qwen riêng cho classifier (để trống dùng chung OLLAMA_MODEL)</w:t>
+      </w:r>
+    </w:p>
+    <w:p>
+      <w:r>
+        <w:rPr>
+          <w:sz w:val="18"/>
+        </w:rPr>
+        <w:t>`CLASSIFIER_TIMEOUT` | `20` | Thời gian chờ tối đa mỗi lần gọi classifier (giây) — quá hạn suy giảm mềm về lớp 3</w:t>
+      </w:r>
+    </w:p>
     <w:p/>
     <w:p>
       <w:r>
@@ -2270,7 +3027,7 @@
         <w:pStyle w:val="Heading1"/>
       </w:pPr>
       <w:r>
-        <w:t>9. Tham khảo</w:t>
+        <w:t>10. Tham khảo</w:t>
       </w:r>
     </w:p>
     <w:p/>
@@ -2378,7 +3135,7 @@
         <w:pStyle w:val="Heading1"/>
       </w:pPr>
       <w:r>
-        <w:t>10. Phiên bản &amp; Lịch sử</w:t>
+        <w:t>11. Phiên bản &amp; Lịch sử</w:t>
       </w:r>
     </w:p>
     <w:p/>
@@ -2396,6 +3153,14 @@
           <w:sz w:val="18"/>
         </w:rPr>
         <w:t>1.0 | 2026-10-12 | Bản kiến trúc đầu tiên - Hybrid RAG với BM25 + BGE-M3 + RRF</w:t>
+      </w:r>
+    </w:p>
+    <w:p>
+      <w:r>
+        <w:rPr>
+          <w:sz w:val="18"/>
+        </w:rPr>
+        <w:t>2.0 | 2026-10-21 | Luồng 4 tầng → 6 tầng: thêm tầng phân loại câu hỏi + router truy xuất theo lớp, tách truy vấn con cho SO_SANH, prompt biến thể theo loại câu hỏi</w:t>
       </w:r>
     </w:p>
     <w:p/>

</xml_diff>